<commit_message>
feat: LLM 网关新增 Anthropic Messages 协议支持
- 新增 internal/llm/anthropic.go：AnthropicProvider 实现 LLMProvider
  接口（纯标准库），含消息转换（system 顶层化、tool_result/tool_use
  块、角色交替合并）、input_schema 工具映射、stop_reason 映射、
  cache_read_input_tokens 缓存命中计量、SSE 流式解析（跨 chunk 归并）
- 供应商配置新增 protocol 字段（openai 默认 / anthropic），gateway
  按协议装配；重试/熔断/降级/路由对两种协议透明；anthropic 协议
  base_url 可省略（默认官方端点），认证使用 x-api-key 头
- config 校验非法 protocol 值；config.yaml 附 Claude 接入示例
- 新增 13 个离线测试（请求结构/响应解析/流式/错误/装配）
- 文档：使用手册新增 6.5 节与配置/环境变量条目，技术方案第 4 章
  更新为双协议架构，AGENTS.md 同步
</commit_message>
<xml_diff>
--- a/AI_Agent_技术方案.docx
+++ b/AI_Agent_技术方案.docx
@@ -1430,7 +1430,7 @@
         <w:rPr>
           <w:b w:val="0"/>
         </w:rPr>
-        <w:t>LLM 网关采用统一抽象接口 + Provider 适配器的设计模式，屏蔽不同模型 API 的差异性。上层业务代码只依赖统一接口，底层通过 Provider 注册机制支持动态添加新模型。</w:t>
+        <w:t>LLM 网关采用统一抽象接口 + Provider 适配器的设计模式，屏蔽不同模型 API 的差异性。上层业务代码只依赖统一接口，底层通过 Provider 注册机制支持动态添加新模型。网关当前支持两种 API 协议：OpenAI Chat Completions 兼容协议（默认，protocol 字段为 "openai"，可省略）与 Anthropic Messages API（protocol: "anthropic"），由供应商配置的 protocol 字段选择对应的 Provider 实现。</w:t>
       </w:r>
     </w:p>
     <w:p>
@@ -1465,6 +1465,23 @@
         <w:t>registry.Register(&amp;QwenProvider{...})</w:t>
         <w:br/>
         <w:t>registry.Register(&amp;OllamaProvider{...})</w:t>
+        <w:br/>
+        <w:t>registry.Register(&amp;AnthropicProvider{...})  // protocol: "anthropic"，Anthropic Messages API</w:t>
+      </w:r>
+    </w:p>
+    <w:p>
+      <w:r>
+        <w:t>双协议支持：OpenAI 兼容协议由通用 Provider 实现（internal/llm/generic.go），覆盖 DeepSeek、通义千问、Ollama 及一切兼容服务；Anthropic 协议由独立 Provider 实现（internal/llm/anthropic.go），用于 Claude 系列模型。Anthropic 供应商的 base_url 可省略（默认 https://api.anthropic.com/v1/messages）；认证使用 x-api-key 请求头传递 API Key，并自动携带 anthropic-version 版本头。</w:t>
+      </w:r>
+    </w:p>
+    <w:p>
+      <w:r>
+        <w:t>协议转换：统一 ChatRequest/ChatResponse 与 Anthropic Messages API 之间的差异由 Provider 内部转换——system 消息提升为请求顶层 system 字段；工具执行结果（tool 消息）转为 user 消息中的 tool_result 块；模型的工具调用以 tool_use 块解析回统一结构；stop_reason 映射为统一的结束原因；usage 计量包含 cache_read_input_tokens（prompt 缓存命中计量）；流式响应按 Anthropic SSE 事件序列解析为统一的增量块。</w:t>
+      </w:r>
+    </w:p>
+    <w:p>
+      <w:r>
+        <w:t>对网关透明：重试（指数退避 + 抖动）、熔断器、降级链与模型路由均作用于统一接口层之上，对两种协议完全透明——Anthropic 供应商与其他供应商一样参与故障转移与降级，无需特殊处理。</w:t>
       </w:r>
     </w:p>
     <w:p>
@@ -1858,6 +1875,14 @@
       </w:pPr>
       <w:r>
         <w:t>Ollama：依赖具体模型是否支持 tool_use，不支持时回退到 prompt 注入方式</w:t>
+      </w:r>
+    </w:p>
+    <w:p>
+      <w:pPr>
+        <w:pStyle w:val="ListBullet"/>
+      </w:pPr>
+      <w:r>
+        <w:t>Anthropic Claude：使用 tools 字段（input_schema 声明参数 Schema），工具调用以 tool_use 块返回，工具结果以 user 消息中的 tool_result 块回传</w:t>
       </w:r>
     </w:p>
     <w:p>

</xml_diff>